<commit_message>
Add author attribution to all project files and DOI to published documents
</commit_message>
<xml_diff>
--- a/对未来的思考 Thoughts on the Future.docx
+++ b/对未来的思考 Thoughts on the Future.docx
@@ -4,7 +4,102 @@
   <w:body>
     <w:p>
       <w:pPr>
-        <w:pStyle w:val="user2"/>
+        <w:pStyle w:val="Normal"/>
+        <w:bidi w:val="0"/>
+        <w:jc w:val="center"/>
+        <w:rPr>
+          <w:rFonts w:ascii="Edwardian Script ITC" w:hAnsi="Edwardian Script ITC"/>
+          <w:b w:val="false"/>
+          <w:i w:val="false"/>
+          <w:caps w:val="false"/>
+          <w:smallCaps w:val="false"/>
+          <w:color w:val="141414"/>
+          <w:spacing w:val="0"/>
+          <w:sz w:val="36"/>
+          <w:szCs w:val="36"/>
+        </w:rPr>
+      </w:pPr>
+      <w:r>
+        <w:rPr>
+          <w:rFonts w:ascii="Edwardian Script ITC" w:hAnsi="Edwardian Script ITC"/>
+          <w:b w:val="false"/>
+          <w:i w:val="false"/>
+          <w:caps w:val="false"/>
+          <w:smallCaps w:val="false"/>
+          <w:color w:val="141414"/>
+          <w:spacing w:val="0"/>
+          <w:sz w:val="36"/>
+          <w:szCs w:val="36"/>
+        </w:rPr>
+        <w:t>Author: Adrian Mercer</w:t>
+      </w:r>
+    </w:p>
+    <w:p>
+      <w:pPr>
+        <w:pStyle w:val="Normal"/>
+        <w:bidi w:val="0"/>
+        <w:jc w:val="center"/>
+        <w:rPr>
+          <w:rFonts w:ascii="Californian FB" w:hAnsi="Californian FB"/>
+          <w:b w:val="false"/>
+          <w:i w:val="false"/>
+          <w:caps w:val="false"/>
+          <w:smallCaps w:val="false"/>
+          <w:color w:val="141414"/>
+          <w:spacing w:val="0"/>
+          <w:sz w:val="28"/>
+          <w:szCs w:val="28"/>
+        </w:rPr>
+      </w:pPr>
+      <w:r>
+        <w:rPr>
+          <w:rFonts w:ascii="Californian FB" w:hAnsi="Californian FB"/>
+          <w:b w:val="false"/>
+          <w:i w:val="false"/>
+          <w:caps w:val="false"/>
+          <w:smallCaps w:val="false"/>
+          <w:color w:val="141414"/>
+          <w:spacing w:val="0"/>
+          <w:sz w:val="28"/>
+          <w:szCs w:val="28"/>
+        </w:rPr>
+        <w:t>First archival publication: Zenodo</w:t>
+      </w:r>
+    </w:p>
+    <w:p>
+      <w:pPr>
+        <w:pStyle w:val="Normal"/>
+        <w:jc w:val="center"/>
+        <w:rPr>
+          <w:rFonts w:ascii="Californian FB" w:hAnsi="Californian FB"/>
+          <w:b w:val="false"/>
+          <w:i w:val="false"/>
+          <w:caps w:val="false"/>
+          <w:smallCaps w:val="false"/>
+          <w:color w:val="141414"/>
+          <w:spacing w:val="0"/>
+          <w:sz w:val="28"/>
+          <w:szCs w:val="28"/>
+        </w:rPr>
+      </w:pPr>
+      <w:r>
+        <w:rPr>
+          <w:rFonts w:ascii="Californian FB" w:hAnsi="Californian FB"/>
+          <w:b w:val="false"/>
+          <w:i w:val="false"/>
+          <w:caps w:val="false"/>
+          <w:smallCaps w:val="false"/>
+          <w:color w:val="141414"/>
+          <w:spacing w:val="0"/>
+          <w:sz w:val="28"/>
+          <w:szCs w:val="28"/>
+        </w:rPr>
+        <w:t xml:space="preserve">DOI : 10.5281/zenodo.21386559 </w:t>
+      </w:r>
+    </w:p>
+    <w:p>
+      <w:pPr>
+        <w:pStyle w:val="Style16"/>
         <w:rPr/>
       </w:pPr>
       <w:r>
@@ -1074,7 +1169,7 @@
     </w:p>
     <w:p>
       <w:pPr>
-        <w:pStyle w:val="user2"/>
+        <w:pStyle w:val="Style16"/>
         <w:rPr/>
       </w:pPr>
       <w:r>
@@ -1309,9 +1404,9 @@
     <w:pPr>
       <w:widowControl/>
       <w:suppressAutoHyphens w:val="true"/>
-      <w:overflowPunct w:val="false"/>
+      <w:overflowPunct w:val="true"/>
       <w:bidi w:val="0"/>
-      <w:spacing w:before="0" w:after="0"/>
+      <w:spacing w:before="0" w:after="454"/>
       <w:jc w:val="start"/>
     </w:pPr>
     <w:rPr>
@@ -1425,8 +1520,8 @@
       <w:rFonts w:cs="Lucida Sans"/>
     </w:rPr>
   </w:style>
-  <w:style w:type="paragraph" w:styleId="user2">
-    <w:name w:val="成段引文 (user)"/>
+  <w:style w:type="paragraph" w:styleId="Style16">
+    <w:name w:val="成段引文"/>
     <w:basedOn w:val="Normal"/>
     <w:qFormat/>
     <w:pPr>

</xml_diff>